<commit_message>
docs: add new report screenshots
</commit_message>
<xml_diff>
--- a/Lr78/Screenshots.docx
+++ b/Lr78/Screenshots.docx
@@ -19,18 +19,7 @@
           <w:szCs w:val="48"/>
           <w:u w:val="single"/>
         </w:rPr>
-        <w:t xml:space="preserve">ДЛЯ </w:t>
-      </w:r>
-      <w:r>
-        <w:rPr>
-          <w:b/>
-          <w:bCs/>
-          <w:color w:val="FF0000"/>
-          <w:sz w:val="48"/>
-          <w:szCs w:val="48"/>
-          <w:u w:val="single"/>
-        </w:rPr>
-        <w:t>ТОХИ</w:t>
+        <w:t>ДЛЯ ТОХИ</w:t>
       </w:r>
       <w:r>
         <w:rPr>
@@ -65,6 +54,9 @@
         <w:pStyle w:val="a3"/>
       </w:pPr>
       <w:r>
+        <w:rPr>
+          <w:noProof/>
+        </w:rPr>
         <w:drawing>
           <wp:inline distT="0" distB="0" distL="0" distR="0" wp14:anchorId="793B7A09" wp14:editId="79C5A45A">
             <wp:extent cx="2772162" cy="1971950"/>
@@ -105,14 +97,35 @@
     <w:p>
       <w:pPr>
         <w:pStyle w:val="a3"/>
-      </w:pPr>
-      <w:r>
-        <w:t xml:space="preserve">Код программы </w:t>
+        <w:rPr>
+          <w:lang w:val="en-US"/>
+        </w:rPr>
+      </w:pPr>
+      <w:r>
+        <w:t>Код</w:t>
+      </w:r>
+      <w:r>
+        <w:rPr>
+          <w:lang w:val="en-US"/>
+        </w:rPr>
+        <w:t xml:space="preserve"> </w:t>
+      </w:r>
+      <w:r>
+        <w:t>программы</w:t>
+      </w:r>
+      <w:r>
+        <w:rPr>
+          <w:lang w:val="en-US"/>
+        </w:rPr>
+        <w:t xml:space="preserve"> </w:t>
       </w:r>
     </w:p>
     <w:p>
       <w:pPr>
         <w:pStyle w:val="a3"/>
+        <w:rPr>
+          <w:lang w:val="en-US"/>
+        </w:rPr>
       </w:pPr>
     </w:p>
     <w:p>
@@ -150,21 +163,8 @@
           <w:highlight w:val="white"/>
           <w:lang w:val="en-US"/>
         </w:rPr>
-        <w:t xml:space="preserve"> </w:t>
-      </w:r>
-      <w:proofErr w:type="spellStart"/>
-      <w:r>
-        <w:rPr>
-          <w:rFonts w:ascii="Cascadia Mono" w:hAnsi="Cascadia Mono" w:cs="Cascadia Mono"/>
-          <w:color w:val="000000"/>
-          <w:sz w:val="19"/>
-          <w:szCs w:val="19"/>
-          <w:highlight w:val="white"/>
-          <w:lang w:val="en-US"/>
-        </w:rPr>
-        <w:t>pdb</w:t>
-      </w:r>
-      <w:proofErr w:type="spellEnd"/>
+        <w:t xml:space="preserve"> pdb</w:t>
+      </w:r>
     </w:p>
     <w:p>
       <w:pPr>
@@ -334,7 +334,6 @@
           <w:lang w:val="en-US"/>
         </w:rPr>
       </w:pPr>
-      <w:proofErr w:type="spellStart"/>
       <w:r>
         <w:rPr>
           <w:rFonts w:ascii="Cascadia Mono" w:hAnsi="Cascadia Mono" w:cs="Cascadia Mono"/>
@@ -356,19 +355,7 @@
           <w:highlight w:val="white"/>
           <w:lang w:val="en-US"/>
         </w:rPr>
-        <w:t>trace</w:t>
-      </w:r>
-      <w:proofErr w:type="spellEnd"/>
-      <w:r>
-        <w:rPr>
-          <w:rFonts w:ascii="Cascadia Mono" w:hAnsi="Cascadia Mono" w:cs="Cascadia Mono"/>
-          <w:color w:val="000000"/>
-          <w:sz w:val="19"/>
-          <w:szCs w:val="19"/>
-          <w:highlight w:val="white"/>
-          <w:lang w:val="en-US"/>
-        </w:rPr>
-        <w:t>(</w:t>
+        <w:t>trace(</w:t>
       </w:r>
       <w:proofErr w:type="gramEnd"/>
       <w:r>
@@ -388,6 +375,9 @@
         <w:pStyle w:val="a3"/>
       </w:pPr>
       <w:r>
+        <w:rPr>
+          <w:noProof/>
+        </w:rPr>
         <w:drawing>
           <wp:inline distT="0" distB="0" distL="0" distR="0" wp14:anchorId="33ACF926" wp14:editId="40DC5912">
             <wp:extent cx="5940425" cy="2295525"/>
@@ -438,6 +428,9 @@
         <w:pStyle w:val="a3"/>
       </w:pPr>
       <w:r>
+        <w:rPr>
+          <w:noProof/>
+        </w:rPr>
         <w:drawing>
           <wp:inline distT="0" distB="0" distL="0" distR="0" wp14:anchorId="03946FEF" wp14:editId="5215A5A2">
             <wp:extent cx="5940425" cy="1803400"/>
@@ -488,6 +481,9 @@
         <w:pStyle w:val="a3"/>
       </w:pPr>
       <w:r>
+        <w:rPr>
+          <w:noProof/>
+        </w:rPr>
         <w:lastRenderedPageBreak/>
         <w:drawing>
           <wp:inline distT="0" distB="0" distL="0" distR="0" wp14:anchorId="42C4E7E5" wp14:editId="1701259E">
@@ -551,16 +547,7 @@
           <w:szCs w:val="32"/>
           <w:u w:val="single"/>
         </w:rPr>
-        <w:t>Задание</w:t>
-      </w:r>
-      <w:r>
-        <w:rPr>
-          <w:rFonts w:ascii="Arial Black" w:hAnsi="Arial Black"/>
-          <w:sz w:val="32"/>
-          <w:szCs w:val="32"/>
-          <w:u w:val="single"/>
-        </w:rPr>
-        <w:t xml:space="preserve"> 2</w:t>
+        <w:t>Задание 2</w:t>
       </w:r>
     </w:p>
     <w:p>
@@ -568,6 +555,9 @@
         <w:pStyle w:val="a3"/>
       </w:pPr>
       <w:r>
+        <w:rPr>
+          <w:noProof/>
+        </w:rPr>
         <w:drawing>
           <wp:inline distT="0" distB="0" distL="0" distR="0" wp14:anchorId="05408291" wp14:editId="3B1D5239">
             <wp:extent cx="5940425" cy="1451610"/>
@@ -611,60 +601,15 @@
       </w:r>
     </w:p>
     <w:p>
-      <w:r>
-        <w:br w:type="page"/>
-      </w:r>
-    </w:p>
-    <w:p>
-      <w:pPr>
-        <w:rPr>
-          <w:b/>
-          <w:bCs/>
-          <w:color w:val="FF0000"/>
-          <w:sz w:val="48"/>
-          <w:szCs w:val="48"/>
-          <w:u w:val="single"/>
-        </w:rPr>
-      </w:pPr>
-      <w:r>
-        <w:rPr>
-          <w:b/>
-          <w:bCs/>
-          <w:color w:val="FF0000"/>
-          <w:sz w:val="48"/>
-          <w:szCs w:val="48"/>
-          <w:u w:val="single"/>
-        </w:rPr>
-        <w:lastRenderedPageBreak/>
-        <w:t>ДЛЯ ЭДИКА</w:t>
-      </w:r>
-    </w:p>
-    <w:p>
-      <w:pPr>
-        <w:rPr>
-          <w:rFonts w:ascii="Arial Black" w:hAnsi="Arial Black"/>
-          <w:sz w:val="32"/>
-          <w:szCs w:val="32"/>
-          <w:u w:val="single"/>
-        </w:rPr>
-      </w:pPr>
-      <w:r>
-        <w:rPr>
-          <w:rFonts w:ascii="Arial Black" w:hAnsi="Arial Black"/>
-          <w:sz w:val="32"/>
-          <w:szCs w:val="32"/>
-          <w:u w:val="single"/>
-        </w:rPr>
-        <w:t>Задание 1</w:t>
-      </w:r>
-    </w:p>
-    <w:p>
+      <w:pPr>
+        <w:pStyle w:val="a3"/>
+      </w:pPr>
       <w:r>
         <w:drawing>
-          <wp:inline distT="0" distB="0" distL="0" distR="0" wp14:anchorId="3A677188" wp14:editId="2D7B4074">
-            <wp:extent cx="4210638" cy="2086266"/>
-            <wp:effectExtent l="0" t="0" r="0" b="9525"/>
-            <wp:docPr id="4" name="Рисунок 4"/>
+          <wp:inline distT="0" distB="0" distL="0" distR="0" wp14:anchorId="50C367A4" wp14:editId="683890E5">
+            <wp:extent cx="5940425" cy="1266825"/>
+            <wp:effectExtent l="0" t="0" r="3175" b="9525"/>
+            <wp:docPr id="8" name="Рисунок 8"/>
             <wp:cNvGraphicFramePr>
               <a:graphicFrameLocks xmlns:a="http://schemas.openxmlformats.org/drawingml/2006/main" noChangeAspect="1"/>
             </wp:cNvGraphicFramePr>
@@ -684,7 +629,7 @@
                   <pic:spPr>
                     <a:xfrm>
                       <a:off x="0" y="0"/>
-                      <a:ext cx="4210638" cy="2086266"/>
+                      <a:ext cx="5940425" cy="1266825"/>
                     </a:xfrm>
                     <a:prstGeom prst="rect">
                       <a:avLst/>
@@ -698,305 +643,66 @@
       </w:r>
     </w:p>
     <w:p>
-      <w:pPr>
-        <w:autoSpaceDE w:val="0"/>
-        <w:autoSpaceDN w:val="0"/>
-        <w:adjustRightInd w:val="0"/>
-        <w:spacing w:after="0" w:line="240" w:lineRule="auto"/>
-        <w:rPr>
-          <w:rFonts w:ascii="Cascadia Mono" w:hAnsi="Cascadia Mono" w:cs="Cascadia Mono"/>
-          <w:color w:val="000000"/>
-          <w:sz w:val="19"/>
-          <w:szCs w:val="19"/>
-          <w:highlight w:val="white"/>
-          <w:lang w:val="en-US"/>
-        </w:rPr>
-      </w:pPr>
-      <w:r>
-        <w:rPr>
-          <w:rFonts w:ascii="Cascadia Mono" w:hAnsi="Cascadia Mono" w:cs="Cascadia Mono"/>
-          <w:color w:val="0000FF"/>
-          <w:sz w:val="19"/>
-          <w:szCs w:val="19"/>
-          <w:highlight w:val="white"/>
-          <w:lang w:val="en-US"/>
-        </w:rPr>
-        <w:t>import</w:t>
-      </w:r>
-      <w:r>
-        <w:rPr>
-          <w:rFonts w:ascii="Cascadia Mono" w:hAnsi="Cascadia Mono" w:cs="Cascadia Mono"/>
-          <w:color w:val="000000"/>
-          <w:sz w:val="19"/>
-          <w:szCs w:val="19"/>
-          <w:highlight w:val="white"/>
-          <w:lang w:val="en-US"/>
-        </w:rPr>
-        <w:t xml:space="preserve"> </w:t>
-      </w:r>
-      <w:proofErr w:type="spellStart"/>
-      <w:r>
-        <w:rPr>
-          <w:rFonts w:ascii="Cascadia Mono" w:hAnsi="Cascadia Mono" w:cs="Cascadia Mono"/>
-          <w:color w:val="000000"/>
-          <w:sz w:val="19"/>
-          <w:szCs w:val="19"/>
-          <w:highlight w:val="white"/>
-          <w:lang w:val="en-US"/>
-        </w:rPr>
-        <w:t>pdb</w:t>
-      </w:r>
-      <w:proofErr w:type="spellEnd"/>
-    </w:p>
-    <w:p>
-      <w:pPr>
-        <w:autoSpaceDE w:val="0"/>
-        <w:autoSpaceDN w:val="0"/>
-        <w:adjustRightInd w:val="0"/>
-        <w:spacing w:after="0" w:line="240" w:lineRule="auto"/>
-        <w:rPr>
-          <w:rFonts w:ascii="Cascadia Mono" w:hAnsi="Cascadia Mono" w:cs="Cascadia Mono"/>
-          <w:color w:val="000000"/>
-          <w:sz w:val="19"/>
-          <w:szCs w:val="19"/>
-          <w:highlight w:val="white"/>
-          <w:lang w:val="en-US"/>
-        </w:rPr>
-      </w:pPr>
-    </w:p>
-    <w:p>
-      <w:pPr>
-        <w:autoSpaceDE w:val="0"/>
-        <w:autoSpaceDN w:val="0"/>
-        <w:adjustRightInd w:val="0"/>
-        <w:spacing w:after="0" w:line="240" w:lineRule="auto"/>
-        <w:rPr>
-          <w:rFonts w:ascii="Cascadia Mono" w:hAnsi="Cascadia Mono" w:cs="Cascadia Mono"/>
-          <w:color w:val="000000"/>
-          <w:sz w:val="19"/>
-          <w:szCs w:val="19"/>
-          <w:highlight w:val="white"/>
-          <w:lang w:val="en-US"/>
-        </w:rPr>
-      </w:pPr>
-      <w:r>
-        <w:rPr>
-          <w:rFonts w:ascii="Cascadia Mono" w:hAnsi="Cascadia Mono" w:cs="Cascadia Mono"/>
-          <w:color w:val="000000"/>
-          <w:sz w:val="19"/>
-          <w:szCs w:val="19"/>
-          <w:highlight w:val="white"/>
-          <w:lang w:val="en-US"/>
-        </w:rPr>
-        <w:t>questions = {}</w:t>
-      </w:r>
-    </w:p>
-    <w:p>
-      <w:pPr>
-        <w:autoSpaceDE w:val="0"/>
-        <w:autoSpaceDN w:val="0"/>
-        <w:adjustRightInd w:val="0"/>
-        <w:spacing w:after="0" w:line="240" w:lineRule="auto"/>
-        <w:rPr>
-          <w:rFonts w:ascii="Cascadia Mono" w:hAnsi="Cascadia Mono" w:cs="Cascadia Mono"/>
-          <w:color w:val="000000"/>
-          <w:sz w:val="19"/>
-          <w:szCs w:val="19"/>
-          <w:highlight w:val="white"/>
-          <w:lang w:val="en-US"/>
-        </w:rPr>
-      </w:pPr>
-    </w:p>
-    <w:p>
-      <w:pPr>
-        <w:autoSpaceDE w:val="0"/>
-        <w:autoSpaceDN w:val="0"/>
-        <w:adjustRightInd w:val="0"/>
-        <w:spacing w:after="0" w:line="240" w:lineRule="auto"/>
-        <w:rPr>
-          <w:rFonts w:ascii="Cascadia Mono" w:hAnsi="Cascadia Mono" w:cs="Cascadia Mono"/>
-          <w:color w:val="000000"/>
-          <w:sz w:val="19"/>
-          <w:szCs w:val="19"/>
-          <w:highlight w:val="white"/>
-          <w:lang w:val="en-US"/>
-        </w:rPr>
-      </w:pPr>
-      <w:r>
-        <w:rPr>
-          <w:rFonts w:ascii="Cascadia Mono" w:hAnsi="Cascadia Mono" w:cs="Cascadia Mono"/>
-          <w:color w:val="000000"/>
-          <w:sz w:val="19"/>
-          <w:szCs w:val="19"/>
-          <w:highlight w:val="white"/>
-          <w:lang w:val="en-US"/>
-        </w:rPr>
-        <w:t xml:space="preserve">mail = </w:t>
-      </w:r>
-      <w:r>
-        <w:rPr>
-          <w:rFonts w:ascii="Cascadia Mono" w:hAnsi="Cascadia Mono" w:cs="Cascadia Mono"/>
-          <w:color w:val="A31515"/>
-          <w:sz w:val="19"/>
-          <w:szCs w:val="19"/>
-          <w:highlight w:val="white"/>
-          <w:lang w:val="en-US"/>
-        </w:rPr>
-        <w:t>'ADRESS'</w:t>
-      </w:r>
-    </w:p>
-    <w:p>
-      <w:pPr>
-        <w:autoSpaceDE w:val="0"/>
-        <w:autoSpaceDN w:val="0"/>
-        <w:adjustRightInd w:val="0"/>
-        <w:spacing w:after="0" w:line="240" w:lineRule="auto"/>
-        <w:rPr>
-          <w:rFonts w:ascii="Cascadia Mono" w:hAnsi="Cascadia Mono" w:cs="Cascadia Mono"/>
-          <w:color w:val="000000"/>
-          <w:sz w:val="19"/>
-          <w:szCs w:val="19"/>
-          <w:highlight w:val="white"/>
-          <w:lang w:val="en-US"/>
-        </w:rPr>
-      </w:pPr>
-      <w:r>
-        <w:rPr>
-          <w:rFonts w:ascii="Cascadia Mono" w:hAnsi="Cascadia Mono" w:cs="Cascadia Mono"/>
-          <w:color w:val="000000"/>
-          <w:sz w:val="19"/>
-          <w:szCs w:val="19"/>
-          <w:highlight w:val="white"/>
-          <w:lang w:val="en-US"/>
-        </w:rPr>
-        <w:t xml:space="preserve">text = </w:t>
-      </w:r>
-      <w:r>
-        <w:rPr>
-          <w:rFonts w:ascii="Cascadia Mono" w:hAnsi="Cascadia Mono" w:cs="Cascadia Mono"/>
-          <w:color w:val="A31515"/>
-          <w:sz w:val="19"/>
-          <w:szCs w:val="19"/>
-          <w:highlight w:val="white"/>
-          <w:lang w:val="en-US"/>
-        </w:rPr>
-        <w:t>'QUEST'</w:t>
-      </w:r>
-    </w:p>
-    <w:p>
-      <w:pPr>
-        <w:autoSpaceDE w:val="0"/>
-        <w:autoSpaceDN w:val="0"/>
-        <w:adjustRightInd w:val="0"/>
-        <w:spacing w:after="0" w:line="240" w:lineRule="auto"/>
-        <w:rPr>
-          <w:rFonts w:ascii="Cascadia Mono" w:hAnsi="Cascadia Mono" w:cs="Cascadia Mono"/>
-          <w:color w:val="000000"/>
-          <w:sz w:val="19"/>
-          <w:szCs w:val="19"/>
-          <w:highlight w:val="white"/>
-          <w:lang w:val="en-US"/>
-        </w:rPr>
-      </w:pPr>
-      <w:r>
-        <w:rPr>
-          <w:rFonts w:ascii="Cascadia Mono" w:hAnsi="Cascadia Mono" w:cs="Cascadia Mono"/>
-          <w:color w:val="000000"/>
-          <w:sz w:val="19"/>
-          <w:szCs w:val="19"/>
-          <w:highlight w:val="white"/>
-          <w:lang w:val="en-US"/>
-        </w:rPr>
-        <w:t xml:space="preserve">questions[mail] = text </w:t>
-      </w:r>
-    </w:p>
-    <w:p>
-      <w:pPr>
-        <w:autoSpaceDE w:val="0"/>
-        <w:autoSpaceDN w:val="0"/>
-        <w:adjustRightInd w:val="0"/>
-        <w:spacing w:after="0" w:line="240" w:lineRule="auto"/>
-        <w:rPr>
-          <w:rFonts w:ascii="Cascadia Mono" w:hAnsi="Cascadia Mono" w:cs="Cascadia Mono"/>
-          <w:color w:val="000000"/>
-          <w:sz w:val="19"/>
-          <w:szCs w:val="19"/>
-          <w:highlight w:val="white"/>
-          <w:lang w:val="en-US"/>
-        </w:rPr>
-      </w:pPr>
-    </w:p>
-    <w:p>
-      <w:pPr>
-        <w:pStyle w:val="a3"/>
-        <w:rPr>
-          <w:rFonts w:ascii="Cascadia Mono" w:hAnsi="Cascadia Mono" w:cs="Cascadia Mono"/>
-          <w:color w:val="000000"/>
-          <w:sz w:val="19"/>
-          <w:szCs w:val="19"/>
-          <w:lang w:val="en-US"/>
-        </w:rPr>
-      </w:pPr>
-      <w:proofErr w:type="spellStart"/>
-      <w:r>
-        <w:rPr>
-          <w:rFonts w:ascii="Cascadia Mono" w:hAnsi="Cascadia Mono" w:cs="Cascadia Mono"/>
-          <w:color w:val="000000"/>
-          <w:sz w:val="19"/>
-          <w:szCs w:val="19"/>
-          <w:highlight w:val="white"/>
-          <w:lang w:val="en-US"/>
-        </w:rPr>
-        <w:t>pdb.set_</w:t>
-      </w:r>
-      <w:proofErr w:type="gramStart"/>
-      <w:r>
-        <w:rPr>
-          <w:rFonts w:ascii="Cascadia Mono" w:hAnsi="Cascadia Mono" w:cs="Cascadia Mono"/>
-          <w:color w:val="000000"/>
-          <w:sz w:val="19"/>
-          <w:szCs w:val="19"/>
-          <w:highlight w:val="white"/>
-          <w:lang w:val="en-US"/>
-        </w:rPr>
-        <w:t>trace</w:t>
-      </w:r>
-      <w:proofErr w:type="spellEnd"/>
-      <w:r>
-        <w:rPr>
-          <w:rFonts w:ascii="Cascadia Mono" w:hAnsi="Cascadia Mono" w:cs="Cascadia Mono"/>
-          <w:color w:val="000000"/>
-          <w:sz w:val="19"/>
-          <w:szCs w:val="19"/>
-          <w:highlight w:val="white"/>
-          <w:lang w:val="en-US"/>
-        </w:rPr>
-        <w:t>(</w:t>
-      </w:r>
-      <w:proofErr w:type="gramEnd"/>
-      <w:r>
-        <w:rPr>
-          <w:rFonts w:ascii="Cascadia Mono" w:hAnsi="Cascadia Mono" w:cs="Cascadia Mono"/>
-          <w:color w:val="000000"/>
-          <w:sz w:val="19"/>
-          <w:szCs w:val="19"/>
-          <w:highlight w:val="white"/>
-          <w:lang w:val="en-US"/>
-        </w:rPr>
-        <w:t>)</w:t>
-      </w:r>
-      <w:r>
-        <w:rPr>
-          <w:lang w:val="en-US"/>
-        </w:rPr>
-        <w:br/>
-      </w:r>
-      <w:r>
+      <w:r>
+        <w:t>Фиксация изменения</w:t>
+      </w:r>
+      <w:r>
+        <w:br w:type="page"/>
+      </w:r>
+    </w:p>
+    <w:p>
+      <w:pPr>
+        <w:rPr>
+          <w:b/>
+          <w:bCs/>
+          <w:color w:val="FF0000"/>
+          <w:sz w:val="48"/>
+          <w:szCs w:val="48"/>
+          <w:u w:val="single"/>
+        </w:rPr>
+      </w:pPr>
+      <w:r>
+        <w:rPr>
+          <w:b/>
+          <w:bCs/>
+          <w:color w:val="FF0000"/>
+          <w:sz w:val="48"/>
+          <w:szCs w:val="48"/>
+          <w:u w:val="single"/>
+        </w:rPr>
+        <w:lastRenderedPageBreak/>
+        <w:t>ДЛЯ ЭДИКА</w:t>
+      </w:r>
+    </w:p>
+    <w:p>
+      <w:pPr>
+        <w:rPr>
+          <w:rFonts w:ascii="Arial Black" w:hAnsi="Arial Black"/>
+          <w:sz w:val="32"/>
+          <w:szCs w:val="32"/>
+          <w:u w:val="single"/>
+        </w:rPr>
+      </w:pPr>
+      <w:r>
+        <w:rPr>
+          <w:rFonts w:ascii="Arial Black" w:hAnsi="Arial Black"/>
+          <w:sz w:val="32"/>
+          <w:szCs w:val="32"/>
+          <w:u w:val="single"/>
+        </w:rPr>
+        <w:t>Задание 1</w:t>
+      </w:r>
+    </w:p>
+    <w:p>
+      <w:r>
+        <w:rPr>
+          <w:noProof/>
+        </w:rPr>
         <w:drawing>
-          <wp:inline distT="0" distB="0" distL="0" distR="0" wp14:anchorId="53DAA113" wp14:editId="0562342B">
-            <wp:extent cx="3057952" cy="2572109"/>
-            <wp:effectExtent l="0" t="0" r="9525" b="0"/>
-            <wp:docPr id="3" name="Рисунок 3"/>
+          <wp:inline distT="0" distB="0" distL="0" distR="0" wp14:anchorId="3A677188" wp14:editId="2D7B4074">
+            <wp:extent cx="4210638" cy="2086266"/>
+            <wp:effectExtent l="0" t="0" r="0" b="9525"/>
+            <wp:docPr id="4" name="Рисунок 4"/>
             <wp:cNvGraphicFramePr>
               <a:graphicFrameLocks xmlns:a="http://schemas.openxmlformats.org/drawingml/2006/main" noChangeAspect="1"/>
             </wp:cNvGraphicFramePr>
@@ -1016,7 +722,7 @@
                   <pic:spPr>
                     <a:xfrm>
                       <a:off x="0" y="0"/>
-                      <a:ext cx="3057952" cy="2572109"/>
+                      <a:ext cx="4210638" cy="2086266"/>
                     </a:xfrm>
                     <a:prstGeom prst="rect">
                       <a:avLst/>
@@ -1031,23 +737,281 @@
     </w:p>
     <w:p>
       <w:pPr>
+        <w:autoSpaceDE w:val="0"/>
+        <w:autoSpaceDN w:val="0"/>
+        <w:adjustRightInd w:val="0"/>
+        <w:spacing w:after="0" w:line="240" w:lineRule="auto"/>
+        <w:rPr>
+          <w:rFonts w:ascii="Cascadia Mono" w:hAnsi="Cascadia Mono" w:cs="Cascadia Mono"/>
+          <w:color w:val="000000"/>
+          <w:sz w:val="19"/>
+          <w:szCs w:val="19"/>
+          <w:highlight w:val="white"/>
+          <w:lang w:val="en-US"/>
+        </w:rPr>
+      </w:pPr>
+      <w:r>
+        <w:rPr>
+          <w:rFonts w:ascii="Cascadia Mono" w:hAnsi="Cascadia Mono" w:cs="Cascadia Mono"/>
+          <w:color w:val="0000FF"/>
+          <w:sz w:val="19"/>
+          <w:szCs w:val="19"/>
+          <w:highlight w:val="white"/>
+          <w:lang w:val="en-US"/>
+        </w:rPr>
+        <w:t>import</w:t>
+      </w:r>
+      <w:r>
+        <w:rPr>
+          <w:rFonts w:ascii="Cascadia Mono" w:hAnsi="Cascadia Mono" w:cs="Cascadia Mono"/>
+          <w:color w:val="000000"/>
+          <w:sz w:val="19"/>
+          <w:szCs w:val="19"/>
+          <w:highlight w:val="white"/>
+          <w:lang w:val="en-US"/>
+        </w:rPr>
+        <w:t xml:space="preserve"> pdb</w:t>
+      </w:r>
+    </w:p>
+    <w:p>
+      <w:pPr>
+        <w:autoSpaceDE w:val="0"/>
+        <w:autoSpaceDN w:val="0"/>
+        <w:adjustRightInd w:val="0"/>
+        <w:spacing w:after="0" w:line="240" w:lineRule="auto"/>
+        <w:rPr>
+          <w:rFonts w:ascii="Cascadia Mono" w:hAnsi="Cascadia Mono" w:cs="Cascadia Mono"/>
+          <w:color w:val="000000"/>
+          <w:sz w:val="19"/>
+          <w:szCs w:val="19"/>
+          <w:highlight w:val="white"/>
+          <w:lang w:val="en-US"/>
+        </w:rPr>
+      </w:pPr>
+    </w:p>
+    <w:p>
+      <w:pPr>
+        <w:autoSpaceDE w:val="0"/>
+        <w:autoSpaceDN w:val="0"/>
+        <w:adjustRightInd w:val="0"/>
+        <w:spacing w:after="0" w:line="240" w:lineRule="auto"/>
+        <w:rPr>
+          <w:rFonts w:ascii="Cascadia Mono" w:hAnsi="Cascadia Mono" w:cs="Cascadia Mono"/>
+          <w:color w:val="000000"/>
+          <w:sz w:val="19"/>
+          <w:szCs w:val="19"/>
+          <w:highlight w:val="white"/>
+          <w:lang w:val="en-US"/>
+        </w:rPr>
+      </w:pPr>
+      <w:r>
+        <w:rPr>
+          <w:rFonts w:ascii="Cascadia Mono" w:hAnsi="Cascadia Mono" w:cs="Cascadia Mono"/>
+          <w:color w:val="000000"/>
+          <w:sz w:val="19"/>
+          <w:szCs w:val="19"/>
+          <w:highlight w:val="white"/>
+          <w:lang w:val="en-US"/>
+        </w:rPr>
+        <w:t>questions = {}</w:t>
+      </w:r>
+    </w:p>
+    <w:p>
+      <w:pPr>
+        <w:autoSpaceDE w:val="0"/>
+        <w:autoSpaceDN w:val="0"/>
+        <w:adjustRightInd w:val="0"/>
+        <w:spacing w:after="0" w:line="240" w:lineRule="auto"/>
+        <w:rPr>
+          <w:rFonts w:ascii="Cascadia Mono" w:hAnsi="Cascadia Mono" w:cs="Cascadia Mono"/>
+          <w:color w:val="000000"/>
+          <w:sz w:val="19"/>
+          <w:szCs w:val="19"/>
+          <w:highlight w:val="white"/>
+          <w:lang w:val="en-US"/>
+        </w:rPr>
+      </w:pPr>
+    </w:p>
+    <w:p>
+      <w:pPr>
+        <w:autoSpaceDE w:val="0"/>
+        <w:autoSpaceDN w:val="0"/>
+        <w:adjustRightInd w:val="0"/>
+        <w:spacing w:after="0" w:line="240" w:lineRule="auto"/>
+        <w:rPr>
+          <w:rFonts w:ascii="Cascadia Mono" w:hAnsi="Cascadia Mono" w:cs="Cascadia Mono"/>
+          <w:color w:val="000000"/>
+          <w:sz w:val="19"/>
+          <w:szCs w:val="19"/>
+          <w:highlight w:val="white"/>
+          <w:lang w:val="en-US"/>
+        </w:rPr>
+      </w:pPr>
+      <w:r>
+        <w:rPr>
+          <w:rFonts w:ascii="Cascadia Mono" w:hAnsi="Cascadia Mono" w:cs="Cascadia Mono"/>
+          <w:color w:val="000000"/>
+          <w:sz w:val="19"/>
+          <w:szCs w:val="19"/>
+          <w:highlight w:val="white"/>
+          <w:lang w:val="en-US"/>
+        </w:rPr>
+        <w:t xml:space="preserve">mail = </w:t>
+      </w:r>
+      <w:r>
+        <w:rPr>
+          <w:rFonts w:ascii="Cascadia Mono" w:hAnsi="Cascadia Mono" w:cs="Cascadia Mono"/>
+          <w:color w:val="A31515"/>
+          <w:sz w:val="19"/>
+          <w:szCs w:val="19"/>
+          <w:highlight w:val="white"/>
+          <w:lang w:val="en-US"/>
+        </w:rPr>
+        <w:t>'ADRESS'</w:t>
+      </w:r>
+    </w:p>
+    <w:p>
+      <w:pPr>
+        <w:autoSpaceDE w:val="0"/>
+        <w:autoSpaceDN w:val="0"/>
+        <w:adjustRightInd w:val="0"/>
+        <w:spacing w:after="0" w:line="240" w:lineRule="auto"/>
+        <w:rPr>
+          <w:rFonts w:ascii="Cascadia Mono" w:hAnsi="Cascadia Mono" w:cs="Cascadia Mono"/>
+          <w:color w:val="000000"/>
+          <w:sz w:val="19"/>
+          <w:szCs w:val="19"/>
+          <w:highlight w:val="white"/>
+          <w:lang w:val="en-US"/>
+        </w:rPr>
+      </w:pPr>
+      <w:r>
+        <w:rPr>
+          <w:rFonts w:ascii="Cascadia Mono" w:hAnsi="Cascadia Mono" w:cs="Cascadia Mono"/>
+          <w:color w:val="000000"/>
+          <w:sz w:val="19"/>
+          <w:szCs w:val="19"/>
+          <w:highlight w:val="white"/>
+          <w:lang w:val="en-US"/>
+        </w:rPr>
+        <w:t xml:space="preserve">text = </w:t>
+      </w:r>
+      <w:r>
+        <w:rPr>
+          <w:rFonts w:ascii="Cascadia Mono" w:hAnsi="Cascadia Mono" w:cs="Cascadia Mono"/>
+          <w:color w:val="A31515"/>
+          <w:sz w:val="19"/>
+          <w:szCs w:val="19"/>
+          <w:highlight w:val="white"/>
+          <w:lang w:val="en-US"/>
+        </w:rPr>
+        <w:t>'QUEST'</w:t>
+      </w:r>
+    </w:p>
+    <w:p>
+      <w:pPr>
+        <w:autoSpaceDE w:val="0"/>
+        <w:autoSpaceDN w:val="0"/>
+        <w:adjustRightInd w:val="0"/>
+        <w:spacing w:after="0" w:line="240" w:lineRule="auto"/>
+        <w:rPr>
+          <w:rFonts w:ascii="Cascadia Mono" w:hAnsi="Cascadia Mono" w:cs="Cascadia Mono"/>
+          <w:color w:val="000000"/>
+          <w:sz w:val="19"/>
+          <w:szCs w:val="19"/>
+          <w:highlight w:val="white"/>
+          <w:lang w:val="en-US"/>
+        </w:rPr>
+      </w:pPr>
+      <w:r>
+        <w:rPr>
+          <w:rFonts w:ascii="Cascadia Mono" w:hAnsi="Cascadia Mono" w:cs="Cascadia Mono"/>
+          <w:color w:val="000000"/>
+          <w:sz w:val="19"/>
+          <w:szCs w:val="19"/>
+          <w:highlight w:val="white"/>
+          <w:lang w:val="en-US"/>
+        </w:rPr>
+        <w:t xml:space="preserve">questions[mail] = text </w:t>
+      </w:r>
+    </w:p>
+    <w:p>
+      <w:pPr>
+        <w:autoSpaceDE w:val="0"/>
+        <w:autoSpaceDN w:val="0"/>
+        <w:adjustRightInd w:val="0"/>
+        <w:spacing w:after="0" w:line="240" w:lineRule="auto"/>
+        <w:rPr>
+          <w:rFonts w:ascii="Cascadia Mono" w:hAnsi="Cascadia Mono" w:cs="Cascadia Mono"/>
+          <w:color w:val="000000"/>
+          <w:sz w:val="19"/>
+          <w:szCs w:val="19"/>
+          <w:highlight w:val="white"/>
+          <w:lang w:val="en-US"/>
+        </w:rPr>
+      </w:pPr>
+    </w:p>
+    <w:p>
+      <w:pPr>
         <w:pStyle w:val="a3"/>
-      </w:pPr>
-      <w:r>
-        <w:t>Выполнение Операций</w:t>
-      </w:r>
-    </w:p>
-    <w:p>
-      <w:pPr>
-        <w:pStyle w:val="a3"/>
-        <w:jc w:val="both"/>
-      </w:pPr>
-      <w:r>
+        <w:rPr>
+          <w:rFonts w:ascii="Cascadia Mono" w:hAnsi="Cascadia Mono" w:cs="Cascadia Mono"/>
+          <w:color w:val="000000"/>
+          <w:sz w:val="19"/>
+          <w:szCs w:val="19"/>
+          <w:lang w:val="en-US"/>
+        </w:rPr>
+      </w:pPr>
+      <w:r>
+        <w:rPr>
+          <w:rFonts w:ascii="Cascadia Mono" w:hAnsi="Cascadia Mono" w:cs="Cascadia Mono"/>
+          <w:color w:val="000000"/>
+          <w:sz w:val="19"/>
+          <w:szCs w:val="19"/>
+          <w:highlight w:val="white"/>
+          <w:lang w:val="en-US"/>
+        </w:rPr>
+        <w:t>pdb.set_</w:t>
+      </w:r>
+      <w:proofErr w:type="gramStart"/>
+      <w:r>
+        <w:rPr>
+          <w:rFonts w:ascii="Cascadia Mono" w:hAnsi="Cascadia Mono" w:cs="Cascadia Mono"/>
+          <w:color w:val="000000"/>
+          <w:sz w:val="19"/>
+          <w:szCs w:val="19"/>
+          <w:highlight w:val="white"/>
+          <w:lang w:val="en-US"/>
+        </w:rPr>
+        <w:t>trace(</w:t>
+      </w:r>
+      <w:proofErr w:type="gramEnd"/>
+      <w:r>
+        <w:rPr>
+          <w:rFonts w:ascii="Cascadia Mono" w:hAnsi="Cascadia Mono" w:cs="Cascadia Mono"/>
+          <w:color w:val="000000"/>
+          <w:sz w:val="19"/>
+          <w:szCs w:val="19"/>
+          <w:highlight w:val="white"/>
+          <w:lang w:val="en-US"/>
+        </w:rPr>
+        <w:t>)</w:t>
+      </w:r>
+      <w:r>
+        <w:rPr>
+          <w:lang w:val="en-US"/>
+        </w:rPr>
+        <w:br/>
+      </w:r>
+      <w:r>
+        <w:rPr>
+          <w:noProof/>
+        </w:rPr>
         <w:drawing>
-          <wp:inline distT="0" distB="0" distL="0" distR="0" wp14:anchorId="5BEFE513" wp14:editId="276D87B7">
-            <wp:extent cx="5940425" cy="1416050"/>
-            <wp:effectExtent l="0" t="0" r="3175" b="0"/>
-            <wp:docPr id="5" name="Рисунок 5"/>
+          <wp:inline distT="0" distB="0" distL="0" distR="0" wp14:anchorId="53DAA113" wp14:editId="0562342B">
+            <wp:extent cx="3057952" cy="2572109"/>
+            <wp:effectExtent l="0" t="0" r="9525" b="0"/>
+            <wp:docPr id="3" name="Рисунок 3"/>
             <wp:cNvGraphicFramePr>
               <a:graphicFrameLocks xmlns:a="http://schemas.openxmlformats.org/drawingml/2006/main" noChangeAspect="1"/>
             </wp:cNvGraphicFramePr>
@@ -1067,6 +1031,72 @@
                   <pic:spPr>
                     <a:xfrm>
                       <a:off x="0" y="0"/>
+                      <a:ext cx="3057952" cy="2572109"/>
+                    </a:xfrm>
+                    <a:prstGeom prst="rect">
+                      <a:avLst/>
+                    </a:prstGeom>
+                  </pic:spPr>
+                </pic:pic>
+              </a:graphicData>
+            </a:graphic>
+          </wp:inline>
+        </w:drawing>
+      </w:r>
+    </w:p>
+    <w:p>
+      <w:pPr>
+        <w:pStyle w:val="a3"/>
+        <w:rPr>
+          <w:lang w:val="en-US"/>
+        </w:rPr>
+      </w:pPr>
+      <w:r>
+        <w:t>Выполнение</w:t>
+      </w:r>
+      <w:r>
+        <w:rPr>
+          <w:lang w:val="en-US"/>
+        </w:rPr>
+        <w:t xml:space="preserve"> </w:t>
+      </w:r>
+      <w:r>
+        <w:t>Операций</w:t>
+      </w:r>
+    </w:p>
+    <w:p>
+      <w:pPr>
+        <w:pStyle w:val="a3"/>
+        <w:jc w:val="both"/>
+      </w:pPr>
+      <w:r>
+        <w:rPr>
+          <w:noProof/>
+        </w:rPr>
+        <w:drawing>
+          <wp:inline distT="0" distB="0" distL="0" distR="0" wp14:anchorId="5BEFE513" wp14:editId="276D87B7">
+            <wp:extent cx="5940425" cy="1416050"/>
+            <wp:effectExtent l="0" t="0" r="3175" b="0"/>
+            <wp:docPr id="5" name="Рисунок 5"/>
+            <wp:cNvGraphicFramePr>
+              <a:graphicFrameLocks xmlns:a="http://schemas.openxmlformats.org/drawingml/2006/main" noChangeAspect="1"/>
+            </wp:cNvGraphicFramePr>
+            <a:graphic xmlns:a="http://schemas.openxmlformats.org/drawingml/2006/main">
+              <a:graphicData uri="http://schemas.openxmlformats.org/drawingml/2006/picture">
+                <pic:pic xmlns:pic="http://schemas.openxmlformats.org/drawingml/2006/picture">
+                  <pic:nvPicPr>
+                    <pic:cNvPr id="1" name=""/>
+                    <pic:cNvPicPr/>
+                  </pic:nvPicPr>
+                  <pic:blipFill>
+                    <a:blip r:embed="rId12"/>
+                    <a:stretch>
+                      <a:fillRect/>
+                    </a:stretch>
+                  </pic:blipFill>
+                  <pic:spPr>
+                    <a:xfrm>
+                      <a:off x="0" y="0"/>
                       <a:ext cx="5940425" cy="1416050"/>
                     </a:xfrm>
                     <a:prstGeom prst="rect">
@@ -1096,6 +1126,9 @@
         </w:rPr>
       </w:pPr>
       <w:r>
+        <w:rPr>
+          <w:noProof/>
+        </w:rPr>
         <w:lastRenderedPageBreak/>
         <w:drawing>
           <wp:inline distT="0" distB="0" distL="0" distR="0" wp14:anchorId="7289F5CF" wp14:editId="31A7F193">
@@ -1176,6 +1209,9 @@
         <w:pStyle w:val="a3"/>
       </w:pPr>
       <w:r>
+        <w:rPr>
+          <w:noProof/>
+        </w:rPr>
         <w:drawing>
           <wp:inline distT="0" distB="0" distL="0" distR="0" wp14:anchorId="0803BA98" wp14:editId="1482F611">
             <wp:extent cx="5940425" cy="1451610"/>

</xml_diff>